<commit_message>
docs: remove game_clock_state from architecture, API contract, and schema CSV
</commit_message>
<xml_diff>
--- a/Resources/REACT_API_Contract.docx
+++ b/Resources/REACT_API_Contract.docx
@@ -2490,7 +2490,7 @@
           <w:color w:val="888888"/>
           <w:sz w:val="18"/>
         </w:rPr>
-        <w:t>The server stamps recorded_at and game_clock_state — do not send these fields.</w:t>
+        <w:t>The server stamps recorded_at — do not send this field.</w:t>
       </w:r>
     </w:p>
     <w:p>
@@ -3077,7 +3077,7 @@
           <w:color w:val="888888"/>
           <w:sz w:val="18"/>
         </w:rPr>
-        <w:t>The server stamps recorded_at and game_clock_state.</w:t>
+        <w:t>The server stamps recorded_at.</w:t>
       </w:r>
     </w:p>
     <w:p>

</xml_diff>

<commit_message>
Added new EMA fields and fixed JITAI decision engine
</commit_message>
<xml_diff>
--- a/Resources/REACT_API_Contract.docx
+++ b/Resources/REACT_API_Contract.docx
@@ -21,12 +21,7 @@
         <w:spacing w:after="40"/>
       </w:pPr>
       <w:r>
-        <w:rPr>
-          <w:i/>
-          <w:color w:val="888888"/>
-          <w:sz w:val="18"/>
-        </w:rPr>
-        <w:t>Author: Dustin Nguyen     Last updated: 2026-07-06     Audience: Sai (React Native)</w:t>
+        <w:t>Author: Dustin Nguyen     Last updated: 2026-08-18     Audience: Sai (React Native)</w:t>
       </w:r>
     </w:p>
     <w:p>
@@ -275,12 +270,7 @@
         <w:spacing w:after="80"/>
       </w:pPr>
       <w:r>
-        <w:rPr>
-          <w:b w:val="0"/>
-          <w:color w:val="444444"/>
-          <w:sz w:val="20"/>
-        </w:rPr>
-        <w:t>When a request returns 401, the session is fully expired — redirect the user to the login screen and call POST /user/login/ again.</w:t>
+        <w:t>When a request returns 401, call POST /auth/token/refresh/ with the stored refresh token. If that also fails, the session is fully expired — redirect the user to the login screen and call POST /user/login/ again.</w:t>
       </w:r>
     </w:p>
     <w:p>
@@ -1275,12 +1265,7 @@
         <w:spacing w:before="200" w:after="60"/>
       </w:pPr>
       <w:r>
-        <w:rPr>
-          <w:b/>
-          <w:color w:val="005299"/>
-          <w:sz w:val="22"/>
-        </w:rPr>
-        <w:t>5.  Submit EMA Survey Response</w:t>
+        <w:t>5.  Submit EMA Survey Response (legacy)</w:t>
       </w:r>
     </w:p>
     <w:p>
@@ -1301,12 +1286,7 @@
         <w:spacing w:after="80"/>
       </w:pPr>
       <w:r>
-        <w:rPr>
-          <w:b w:val="0"/>
-          <w:color w:val="444444"/>
-          <w:sz w:val="20"/>
-        </w:rPr>
-        <w:t>Call when the participant completes a survey. The prompt_id comes from the push notification data payload.</w:t>
+        <w:t>Legacy path — superseded by GET /ema/next/ and POST /ema/responses/ (sections 6-7) for any prompt drawn from the rotation. Still functional for direct mood/stress/energy writes. The prompt_id comes from the push notification data payload.</w:t>
       </w:r>
     </w:p>
     <w:p>
@@ -1736,16 +1716,169 @@
       </w:r>
     </w:p>
     <w:p>
+      <w:pPr/>
+      <w:r>
+        <w:t>6.  Get Next EMA Prompt</w:t>
+      </w:r>
+    </w:p>
+    <w:p>
+      <w:pPr/>
+      <w:r>
+        <w:t>GET /ema/next/     Auth required.</w:t>
+      </w:r>
+    </w:p>
+    <w:p>
+      <w:pPr/>
+      <w:r>
+        <w:t>Fetch the next EMA check-in (or post-decision-point prompt) for the authenticated participant. Draw the item list and rendering entirely from the response — do not hardcode which questions appear or what they say. Each item is a bundle of one or more sub-questions with mixed types.</w:t>
+      </w:r>
+    </w:p>
+    <w:p>
+      <w:pPr/>
+      <w:r>
+        <w:t>Response 200 (should show):</w:t>
+      </w:r>
+    </w:p>
+    <w:p>
+      <w:pPr/>
+      <w:r>
+        <w:t>{</w:t>
+        <w:br/>
+        <w:t xml:space="preserve">  "should_show": true,</w:t>
+        <w:br/>
+        <w:t xml:space="preserve">  "prompt_id": "EMA-42-20260818143000",</w:t>
+        <w:br/>
+        <w:t xml:space="preserve">  "ema_type": "scheduled_check_in",</w:t>
+        <w:br/>
+        <w:t xml:space="preserve">  "jitai_log_id": null,</w:t>
+        <w:br/>
+        <w:t xml:space="preserve">  "outcome_window_active": false,</w:t>
+        <w:br/>
+        <w:t xml:space="preserve">  "expires_at": "2026-08-18T16:30:00Z",</w:t>
+        <w:br/>
+        <w:t xml:space="preserve">  "daily_cap": 4,</w:t>
+        <w:br/>
+        <w:t xml:space="preserve">  "daily_count": 1,</w:t>
+        <w:br/>
+        <w:t xml:space="preserve">  "items": [</w:t>
+        <w:br/>
+        <w:t xml:space="preserve">    {</w:t>
+        <w:br/>
+        <w:t xml:space="preserve">      "item_id": "B1",</w:t>
+        <w:br/>
+        <w:t xml:space="preserve">      "title": "Current emotions",</w:t>
+        <w:br/>
+        <w:t xml:space="preserve">      "sub_items": [</w:t>
+        <w:br/>
+        <w:t xml:space="preserve">        {</w:t>
+        <w:br/>
+        <w:t xml:space="preserve">          "sub_item_id": "B1_valence",</w:t>
+        <w:br/>
+        <w:t xml:space="preserve">          "text": "How would you describe your current emotional state?",</w:t>
+        <w:br/>
+        <w:t xml:space="preserve">          "response_type": "likert",</w:t>
+        <w:br/>
+        <w:t xml:space="preserve">          "min_value": 1, "max_value": 7,</w:t>
+        <w:br/>
+        <w:t xml:space="preserve">          "low_label": "Very negative", "high_label": "Very positive"</w:t>
+        <w:br/>
+        <w:t xml:space="preserve">        },</w:t>
+        <w:br/>
+        <w:t xml:space="preserve">        { "sub_item_id": "B1_change", "response_type": "single_choice",</w:t>
+        <w:br/>
+        <w:t xml:space="preserve">          "text": "Compared to about an hour ago, how do you feel?",</w:t>
+        <w:br/>
+        <w:t xml:space="preserve">          "choices": ["Much worse", "Somewhat worse", "About the same", "Somewhat better", "Much better"] }</w:t>
+        <w:br/>
+        <w:t xml:space="preserve">      ]</w:t>
+        <w:br/>
+        <w:t xml:space="preserve">    }</w:t>
+        <w:br/>
+        <w:t xml:space="preserve">  ]</w:t>
+        <w:br/>
+        <w:t>}</w:t>
+      </w:r>
+    </w:p>
+    <w:p>
+      <w:pPr/>
+      <w:r>
+        <w:t>Response 200 (should not show):</w:t>
+      </w:r>
+    </w:p>
+    <w:p>
+      <w:pPr/>
+      <w:r>
+        <w:t>{ "should_show": false, "reason": "daily_cap_reached", "outcome_window_active": false, "daily_cap": 4, "daily_count": 4 }</w:t>
+      </w:r>
+    </w:p>
+    <w:p>
+      <w:pPr/>
+      <w:r>
+        <w:t>reason values: daily_cap_reached, outcome_window_already_completed.</w:t>
+      </w:r>
+    </w:p>
+    <w:p>
+      <w:pPr/>
+      <w:r>
+        <w:t>response_type values: likert, single_choice, multi_choice, number, yes_no. single_choice and yes_no expect a string answer from choices; multi_choice expects a list of strings; likert and number expect an integer.</w:t>
+      </w:r>
+    </w:p>
+    <w:p>
+      <w:pPr/>
+    </w:p>
+    <w:p>
+      <w:pPr/>
+      <w:r>
+        <w:t>7.  Submit EMA Item Responses</w:t>
+      </w:r>
+    </w:p>
+    <w:p>
+      <w:pPr/>
+      <w:r>
+        <w:t>POST /ema/responses/     Auth required.</w:t>
+      </w:r>
+    </w:p>
+    <w:p>
+      <w:pPr/>
+      <w:r>
+        <w:t>Request:</w:t>
+      </w:r>
+    </w:p>
+    <w:p>
+      <w:pPr/>
+      <w:r>
+        <w:t>{</w:t>
+        <w:br/>
+        <w:t xml:space="preserve">  "prompt_id": "EMA-42-20260818143000",</w:t>
+        <w:br/>
+        <w:t xml:space="preserve">  "ema_type": "scheduled_check_in",</w:t>
+        <w:br/>
+        <w:t xml:space="preserve">  "responses": [</w:t>
+        <w:br/>
+        <w:t xml:space="preserve">    { "sub_item_id": "B1_valence", "value": 5 },</w:t>
+        <w:br/>
+        <w:t xml:space="preserve">    { "sub_item_id": "B1_change", "value": "Somewhat better" }</w:t>
+        <w:br/>
+        <w:t xml:space="preserve">  ]</w:t>
+        <w:br/>
+        <w:t>}</w:t>
+      </w:r>
+    </w:p>
+    <w:p>
+      <w:pPr/>
+      <w:r>
+        <w:t>Response 201: full EMA object with nested item_responses (same sub_item_id/value shape as the GET above).</w:t>
+      </w:r>
+    </w:p>
+    <w:p>
+      <w:pPr/>
+    </w:p>
+    <w:p>
       <w:pPr>
         <w:spacing w:before="200" w:after="60"/>
       </w:pPr>
       <w:r>
-        <w:rPr>
-          <w:b/>
-          <w:color w:val="005299"/>
-          <w:sz w:val="22"/>
-        </w:rPr>
-        <w:t>6.  Log Phone Session Events</w:t>
+        <w:t>8.  Log Phone Session Events</w:t>
       </w:r>
     </w:p>
     <w:p>
@@ -2511,12 +2644,7 @@
         <w:spacing w:before="200" w:after="60"/>
       </w:pPr>
       <w:r>
-        <w:rPr>
-          <w:b/>
-          <w:color w:val="005299"/>
-          <w:sz w:val="22"/>
-        </w:rPr>
-        <w:t>7.  Log Notification Engagement Events</w:t>
+        <w:t>9.  Log Notification Engagement Events</w:t>
       </w:r>
     </w:p>
     <w:p>
@@ -3100,6 +3228,75 @@
           <w:bottom w:val="single" w:sz="4" w:space="1" w:color="CCCCCC"/>
         </w:pBdr>
       </w:pPr>
+    </w:p>
+    <w:p>
+      <w:pPr/>
+      <w:r>
+        <w:t>10.  Report JITAI Notification Receipt</w:t>
+      </w:r>
+    </w:p>
+    <w:p>
+      <w:pPr/>
+      <w:r>
+        <w:t>POST /jitai/receipt/     Auth required.</w:t>
+      </w:r>
+    </w:p>
+    <w:p>
+      <w:pPr/>
+      <w:r>
+        <w:t>Call as soon as the device becomes aware of a JITAI push, so delivery latency can be measured. app_state should be "foreground", "background", or "killed" depending on what state the app was in when the notification arrived.</w:t>
+      </w:r>
+    </w:p>
+    <w:p>
+      <w:pPr/>
+      <w:r>
+        <w:t>Request:</w:t>
+      </w:r>
+    </w:p>
+    <w:p>
+      <w:pPr/>
+      <w:r>
+        <w:t>{</w:t>
+        <w:br/>
+        <w:t xml:space="preserve">  "jitai_log_id": 7,</w:t>
+        <w:br/>
+        <w:t xml:space="preserve">  "device_received_at": "2026-08-18T20:10:03Z",</w:t>
+        <w:br/>
+        <w:t xml:space="preserve">  "platform": "ios",</w:t>
+        <w:br/>
+        <w:t xml:space="preserve">  "app_state": "foreground"</w:t>
+        <w:br/>
+        <w:t>}</w:t>
+      </w:r>
+    </w:p>
+    <w:p>
+      <w:pPr/>
+      <w:r>
+        <w:t>Response 200:</w:t>
+      </w:r>
+    </w:p>
+    <w:p>
+      <w:pPr/>
+      <w:r>
+        <w:t>{</w:t>
+        <w:br/>
+        <w:t xml:space="preserve">  "message": "Receipt recorded.",</w:t>
+        <w:br/>
+        <w:t xml:space="preserve">  "jitai_log_id": 7,</w:t>
+        <w:br/>
+        <w:t xml:space="preserve">  "delivery_status": "received_on_device",</w:t>
+        <w:br/>
+        <w:t xml:space="preserve">  "delivery_latency_ms": 3000,</w:t>
+        <w:br/>
+        <w:t xml:space="preserve">  "server_observed_latency_ms": 3050,</w:t>
+        <w:br/>
+        <w:t xml:space="preserve">  "total_latency_ms": 4200</w:t>
+        <w:br/>
+        <w:t>}</w:t>
+      </w:r>
+    </w:p>
+    <w:p>
+      <w:pPr/>
     </w:p>
     <w:p>
       <w:pPr>
@@ -4018,6 +4215,50 @@
           </w:p>
         </w:tc>
       </w:tr>
+      <w:tr>
+        <w:tc>
+          <w:tcPr>
+            <w:tcW w:type="dxa" w:w="4680"/>
+          </w:tcPr>
+          <w:p>
+            <w:r>
+              <w:t>GET /dashboard/participants/</w:t>
+            </w:r>
+          </w:p>
+        </w:tc>
+        <w:tc>
+          <w:tcPr>
+            <w:tcW w:type="dxa" w:w="4680"/>
+          </w:tcPr>
+          <w:p>
+            <w:r>
+              <w:t>Researcher dashboard</w:t>
+            </w:r>
+          </w:p>
+        </w:tc>
+      </w:tr>
+      <w:tr>
+        <w:tc>
+          <w:tcPr>
+            <w:tcW w:type="dxa" w:w="4680"/>
+          </w:tcPr>
+          <w:p>
+            <w:r>
+              <w:t>GET /dashboard/latency-events/</w:t>
+            </w:r>
+          </w:p>
+        </w:tc>
+        <w:tc>
+          <w:tcPr>
+            <w:tcW w:type="dxa" w:w="4680"/>
+          </w:tcPr>
+          <w:p>
+            <w:r>
+              <w:t>Researcher dashboard</w:t>
+            </w:r>
+          </w:p>
+        </w:tc>
+      </w:tr>
     </w:tbl>
     <w:p>
       <w:pPr>

</xml_diff>